<commit_message>
Refresh brand collateral: "Your Gateway to Expertise" + wider symbol
- New slogan "Your Gateway to Expertise" (site.slogan → title, footer
  tagline, JSON-LD, banner alt)
- Wider "Broad" gateway symbol throughout: banner lockup re-cropped from
  updated LinkedIn cover; footer/sticky mark now the official
  white-gold-transparent logo; Introduction watermark now the transparent
  corner icon
- Favicons + apple-touch-icon refreshed from new icon set; favicon.ico
  regenerated
- Proper social-share card: public/og-image.png (1200×630), og:image +
  summary_large_image
- Offerings lede aligned to "Financial Services and Operations"
- Brand basics/ replaced with the 31 Aug 2026 asset set (drops stale
  app-icon + old-slogan logos/guide)

Co-Authored-By: Claude Sonnet 5 <noreply@anthropic.com>
</commit_message>
<xml_diff>
--- a/Brand basics/Templates & Guides/Broadgate_Brand_and_Document_Style_Guide.docx
+++ b/Brand basics/Templates & Guides/Broadgate_Brand_and_Document_Style_Guide.docx
@@ -21,7 +21,7 @@
         <w:drawing>
           <wp:inline xmlns:a="http://schemas.openxmlformats.org/drawingml/2006/main" xmlns:pic="http://schemas.openxmlformats.org/drawingml/2006/picture">
             <wp:extent cx="1280160" cy="1306980"/>
-            <wp:docPr id="1" name="Picture 1"/>
+            <wp:docPr id="1" name="Picture 1" descr="Broadgate Option C broad gateway symbol"/>
             <wp:cNvGraphicFramePr>
               <a:graphicFrameLocks noChangeAspect="1"/>
             </wp:cNvGraphicFramePr>
@@ -93,7 +93,7 @@
           <w:color w:val="02234F"/>
           <w:sz w:val="18"/>
         </w:rPr>
-        <w:t>Gateway to Expertise</w:t>
+        <w:t>Your Gateway to Expertise</w:t>
       </w:r>
     </w:p>
     <w:p>
@@ -111,7 +111,7 @@
         <w:jc w:val="center"/>
       </w:pPr>
       <w:r>
-        <w:t>Version 1.1  |  21 August 2026</w:t>
+        <w:t>Version 1.2  |  31 August 2026</w:t>
       </w:r>
     </w:p>
     <w:tbl>
@@ -265,7 +265,7 @@
                 <w:color w:val="17202A"/>
                 <w:sz w:val="22"/>
               </w:rPr>
-              <w:t>Gateway to Expertise</w:t>
+              <w:t>Your Gateway to Expertise</w:t>
             </w:r>
           </w:p>
         </w:tc>
@@ -558,7 +558,7 @@
         <w:drawing>
           <wp:inline xmlns:a="http://schemas.openxmlformats.org/drawingml/2006/main" xmlns:pic="http://schemas.openxmlformats.org/drawingml/2006/picture">
             <wp:extent cx="2011680" cy="2053826"/>
-            <wp:docPr id="2" name="Picture 2"/>
+            <wp:docPr id="2" name="Picture 2" descr="Broadgate Option C broad gateway symbol"/>
             <wp:cNvGraphicFramePr>
               <a:graphicFrameLocks noChangeAspect="1"/>
             </wp:cNvGraphicFramePr>
@@ -600,7 +600,7 @@
     </w:p>
     <w:p>
       <w:r>
-        <w:t>Use the gateway symbol with the Broadgate wordmark wherever space permits. Use the symbol alone for app icons, avatars, favicons and other compact digital placements.</w:t>
+        <w:t>Use the approved Option C broad gateway symbol with the Broadgate wordmark wherever space permits. Its wider form supports the Broadgate name while retaining the established arch and skyline. Use the symbol alone for app icons, avatars, favicons and other compact digital placements.</w:t>
       </w:r>
     </w:p>
     <w:p>
@@ -648,7 +648,7 @@
         <w:pStyle w:val="ListBullet"/>
       </w:pPr>
       <w:r>
-        <w:t>Stretch, rotate, outline or rearrange the mark.</w:t>
+        <w:t>Alter the approved Option C proportions, rotate, outline or rearrange the mark.</w:t>
       </w:r>
     </w:p>
     <w:p>
@@ -696,7 +696,7 @@
         <w:drawing>
           <wp:inline xmlns:a="http://schemas.openxmlformats.org/drawingml/2006/main" xmlns:pic="http://schemas.openxmlformats.org/drawingml/2006/picture">
             <wp:extent cx="2377440" cy="2427249"/>
-            <wp:docPr id="3" name="Picture 3"/>
+            <wp:docPr id="3" name="Picture 3" descr="Broadgate Option C broad gateway symbol"/>
             <wp:cNvGraphicFramePr>
               <a:graphicFrameLocks noChangeAspect="1"/>
             </wp:cNvGraphicFramePr>
@@ -793,7 +793,7 @@
               <w:spacing w:after="0"/>
             </w:pPr>
             <w:r>
-              <w:t>brand/assets/broadgate-app-icon-transparent.png</w:t>
+              <w:t>brand/assets/icons/broadgate-icon-512x512.png</w:t>
             </w:r>
           </w:p>
         </w:tc>
@@ -840,7 +840,7 @@
               <w:spacing w:after="0"/>
             </w:pPr>
             <w:r>
-              <w:t>1241 × 1267 px, RGBA PNG</w:t>
+              <w:t>512 × 512 px, RGBA PNG</w:t>
             </w:r>
           </w:p>
         </w:tc>
@@ -2219,6 +2219,50 @@
           </w:p>
         </w:tc>
       </w:tr>
+      <w:tr>
+        <w:tc>
+          <w:tcPr>
+            <w:tcW w:type="dxa" w:w="3137"/>
+          </w:tcPr>
+          <w:p>
+            <w:r>
+              <w:rPr>
+                <w:rFonts w:ascii="Aptos" w:hAnsi="Aptos"/>
+                <w:sz w:val="16"/>
+              </w:rPr>
+              <w:t>EMAIL-SIGNATURE SLOGAN</w:t>
+            </w:r>
+          </w:p>
+        </w:tc>
+        <w:tc>
+          <w:tcPr>
+            <w:tcW w:type="dxa" w:w="3137"/>
+          </w:tcPr>
+          <w:p>
+            <w:r>
+              <w:rPr>
+                <w:rFonts w:ascii="Aptos" w:hAnsi="Aptos"/>
+                <w:sz w:val="16"/>
+              </w:rPr>
+              <w:t>7 pt</w:t>
+            </w:r>
+          </w:p>
+        </w:tc>
+        <w:tc>
+          <w:tcPr>
+            <w:tcW w:type="dxa" w:w="3137"/>
+          </w:tcPr>
+          <w:p>
+            <w:r>
+              <w:rPr>
+                <w:rFonts w:ascii="Aptos" w:hAnsi="Aptos"/>
+                <w:sz w:val="16"/>
+              </w:rPr>
+              <w:t>Aptos Regular, navy</w:t>
+            </w:r>
+          </w:p>
+        </w:tc>
+      </w:tr>
     </w:tbl>
     <w:p>
       <w:r>
@@ -2685,7 +2729,7 @@
               <w:color w:val="566573"/>
               <w:sz w:val="13"/>
             </w:rPr>
-            <w:t>GATEWAY TO EXPERTISE</w:t>
+            <w:t>YOUR GATEWAY TO EXPERTISE</w:t>
           </w:r>
         </w:p>
       </w:tc>

</xml_diff>